<commit_message>
Add MidAmerica Trixie 2 (AART) to history and open/closed comparison
AART — the team behind Remora 1 and Remora 2 — also built the fully
closed, single-sourced Trixie 2 for BSCRA/Genesis, plus a closed
Slot.it board with a possible future open-source path. Documents this
as evidence that open/closed choices track commercial context rather
than fixed philosophy, reinforcing the paper's behavior-not-business-
model homologation proposal.

Co-Authored-By: Claude Sonnet 5 <noreply@anthropic.com>
</commit_message>
<xml_diff>
--- a/ecom-standardization-charter.docx
+++ b/ecom-standardization-charter.docx
@@ -450,6 +450,36 @@
         <w:pStyle w:val="Heading3"/>
       </w:pPr>
       <w:r>
+        <w:t>2025 — MidAmerica Trixie 2, and one developer spanning the whole spectrum</w:t>
+      </w:r>
+    </w:p>
+    <w:p>
+      <w:pPr>
+        <w:spacing w:after="200"/>
+      </w:pPr>
+      <w:r>
+        <w:rPr>
+          <w:i w:val="0"/>
+        </w:rPr>
+        <w:t>The same team behind Remora 1 and Remora 2 — AART — also designed the MidAmerica Trixie 2, a board built specifically for BSCRA's Genesis racing program. Where Remora is open, Trixie 2 is the opposite: completely closed and single-sourced, with the microcontroller fully locked at RDP Level 2 (see §7) and no published design files, firmware, or manufacturing route for anyone else to build one. AART has separately developed a comparable board for Slot.it — closed today, but designed with the explicit possibility of being open-sourced later.</w:t>
+      </w:r>
+    </w:p>
+    <w:p>
+      <w:pPr>
+        <w:spacing w:after="200"/>
+      </w:pPr>
+      <w:r>
+        <w:rPr>
+          <w:i w:val="0"/>
+        </w:rPr>
+        <w:t>This matters for the standardization debate because it undercuts the assumption that “open” and “closed” map onto fixed ideological camps or competing companies. AART has, within a few years, shipped a fully open design (Remora 1), an open-manufacturing/licensed-commercial design (Remora 2), a fully closed single-source design built to a specific governing body's brief (Trixie 2), and a closed-but-potentially-opening design (the Slot.it board). The model tracks the commercial context of each engagement — a hobbyist community project, a licensed product line, a bespoke commission for a national body's control-part program — not a settled belief about which model is “correct.” That is direct evidence for the position this paper takes in §6: the standard should regulate behavior, not business model, because even a single developer is demonstrably willing to work under any of them depending on who is asking and what they need.</w:t>
+      </w:r>
+    </w:p>
+    <w:p>
+      <w:pPr>
+        <w:pStyle w:val="Heading3"/>
+      </w:pPr>
+      <w:r>
         <w:t>The scrutineering proposal (this repository)</w:t>
       </w:r>
     </w:p>
@@ -494,16 +524,17 @@
         <w:tblLook w:firstColumn="1" w:firstRow="1" w:lastColumn="0" w:lastRow="0" w:noHBand="0" w:noVBand="1" w:val="04A0"/>
       </w:tblPr>
       <w:tblGrid>
-        <w:gridCol w:w="1881"/>
-        <w:gridCol w:w="1881"/>
-        <w:gridCol w:w="1881"/>
-        <w:gridCol w:w="1881"/>
-        <w:gridCol w:w="1881"/>
+        <w:gridCol w:w="1568"/>
+        <w:gridCol w:w="1568"/>
+        <w:gridCol w:w="1568"/>
+        <w:gridCol w:w="1568"/>
+        <w:gridCol w:w="1568"/>
+        <w:gridCol w:w="1568"/>
       </w:tblGrid>
       <w:tr>
         <w:tc>
           <w:tcPr>
-            <w:tcW w:type="dxa" w:w="1881"/>
+            <w:tcW w:type="dxa" w:w="1568"/>
             <w:shd w:val="clear" w:color="auto" w:fill="E7EBE8"/>
           </w:tcPr>
           <w:p>
@@ -519,7 +550,7 @@
         </w:tc>
         <w:tc>
           <w:tcPr>
-            <w:tcW w:type="dxa" w:w="1881"/>
+            <w:tcW w:type="dxa" w:w="1568"/>
             <w:shd w:val="clear" w:color="auto" w:fill="E7EBE8"/>
           </w:tcPr>
           <w:p>
@@ -538,7 +569,7 @@
         </w:tc>
         <w:tc>
           <w:tcPr>
-            <w:tcW w:type="dxa" w:w="1881"/>
+            <w:tcW w:type="dxa" w:w="1568"/>
             <w:shd w:val="clear" w:color="auto" w:fill="E7EBE8"/>
           </w:tcPr>
           <w:p>
@@ -557,7 +588,7 @@
         </w:tc>
         <w:tc>
           <w:tcPr>
-            <w:tcW w:type="dxa" w:w="1881"/>
+            <w:tcW w:type="dxa" w:w="1568"/>
             <w:shd w:val="clear" w:color="auto" w:fill="E7EBE8"/>
           </w:tcPr>
           <w:p>
@@ -576,7 +607,7 @@
         </w:tc>
         <w:tc>
           <w:tcPr>
-            <w:tcW w:type="dxa" w:w="1881"/>
+            <w:tcW w:type="dxa" w:w="1568"/>
             <w:shd w:val="clear" w:color="auto" w:fill="E7EBE8"/>
           </w:tcPr>
           <w:p>
@@ -593,11 +624,30 @@
             </w:r>
           </w:p>
         </w:tc>
+        <w:tc>
+          <w:tcPr>
+            <w:tcW w:type="dxa" w:w="1568"/>
+            <w:shd w:val="clear" w:color="auto" w:fill="E7EBE8"/>
+          </w:tcPr>
+          <w:p>
+            <w:r/>
+            <w:r>
+              <w:rPr>
+                <w:b/>
+                <w:color w:val="1B211F"/>
+                <w:sz w:val="19"/>
+              </w:rPr>
+              <w:t>Trixie 2</w:t>
+              <w:br/>
+              <w:t>AART, closed, single-source</w:t>
+            </w:r>
+          </w:p>
+        </w:tc>
       </w:tr>
       <w:tr>
         <w:tc>
           <w:tcPr>
-            <w:tcW w:type="dxa" w:w="1881"/>
+            <w:tcW w:type="dxa" w:w="1568"/>
           </w:tcPr>
           <w:p>
             <w:r/>
@@ -612,7 +662,7 @@
         </w:tc>
         <w:tc>
           <w:tcPr>
-            <w:tcW w:type="dxa" w:w="1881"/>
+            <w:tcW w:type="dxa" w:w="1568"/>
           </w:tcPr>
           <w:p>
             <w:r/>
@@ -626,7 +676,7 @@
         </w:tc>
         <w:tc>
           <w:tcPr>
-            <w:tcW w:type="dxa" w:w="1881"/>
+            <w:tcW w:type="dxa" w:w="1568"/>
           </w:tcPr>
           <w:p>
             <w:r/>
@@ -640,7 +690,7 @@
         </w:tc>
         <w:tc>
           <w:tcPr>
-            <w:tcW w:type="dxa" w:w="1881"/>
+            <w:tcW w:type="dxa" w:w="1568"/>
           </w:tcPr>
           <w:p>
             <w:r/>
@@ -654,7 +704,21 @@
         </w:tc>
         <w:tc>
           <w:tcPr>
-            <w:tcW w:type="dxa" w:w="1881"/>
+            <w:tcW w:type="dxa" w:w="1568"/>
+          </w:tcPr>
+          <w:p>
+            <w:r/>
+            <w:r>
+              <w:rPr>
+                <w:sz w:val="19"/>
+              </w:rPr>
+              <w:t>Proprietary</w:t>
+            </w:r>
+          </w:p>
+        </w:tc>
+        <w:tc>
+          <w:tcPr>
+            <w:tcW w:type="dxa" w:w="1568"/>
           </w:tcPr>
           <w:p>
             <w:r/>
@@ -670,7 +734,7 @@
       <w:tr>
         <w:tc>
           <w:tcPr>
-            <w:tcW w:type="dxa" w:w="1881"/>
+            <w:tcW w:type="dxa" w:w="1568"/>
           </w:tcPr>
           <w:p>
             <w:r/>
@@ -685,7 +749,7 @@
         </w:tc>
         <w:tc>
           <w:tcPr>
-            <w:tcW w:type="dxa" w:w="1881"/>
+            <w:tcW w:type="dxa" w:w="1568"/>
           </w:tcPr>
           <w:p>
             <w:r/>
@@ -699,7 +763,7 @@
         </w:tc>
         <w:tc>
           <w:tcPr>
-            <w:tcW w:type="dxa" w:w="1881"/>
+            <w:tcW w:type="dxa" w:w="1568"/>
           </w:tcPr>
           <w:p>
             <w:r/>
@@ -713,7 +777,7 @@
         </w:tc>
         <w:tc>
           <w:tcPr>
-            <w:tcW w:type="dxa" w:w="1881"/>
+            <w:tcW w:type="dxa" w:w="1568"/>
           </w:tcPr>
           <w:p>
             <w:r/>
@@ -727,7 +791,7 @@
         </w:tc>
         <w:tc>
           <w:tcPr>
-            <w:tcW w:type="dxa" w:w="1881"/>
+            <w:tcW w:type="dxa" w:w="1568"/>
           </w:tcPr>
           <w:p>
             <w:r/>
@@ -739,11 +803,25 @@
             </w:r>
           </w:p>
         </w:tc>
+        <w:tc>
+          <w:tcPr>
+            <w:tcW w:type="dxa" w:w="1568"/>
+          </w:tcPr>
+          <w:p>
+            <w:r/>
+            <w:r>
+              <w:rPr>
+                <w:sz w:val="19"/>
+              </w:rPr>
+              <w:t>Closed, RDP Level 2 locked</w:t>
+            </w:r>
+          </w:p>
+        </w:tc>
       </w:tr>
       <w:tr>
         <w:tc>
           <w:tcPr>
-            <w:tcW w:type="dxa" w:w="1881"/>
+            <w:tcW w:type="dxa" w:w="1568"/>
           </w:tcPr>
           <w:p>
             <w:r/>
@@ -758,7 +836,7 @@
         </w:tc>
         <w:tc>
           <w:tcPr>
-            <w:tcW w:type="dxa" w:w="1881"/>
+            <w:tcW w:type="dxa" w:w="1568"/>
           </w:tcPr>
           <w:p>
             <w:r/>
@@ -772,7 +850,7 @@
         </w:tc>
         <w:tc>
           <w:tcPr>
-            <w:tcW w:type="dxa" w:w="1881"/>
+            <w:tcW w:type="dxa" w:w="1568"/>
           </w:tcPr>
           <w:p>
             <w:r/>
@@ -786,7 +864,7 @@
         </w:tc>
         <w:tc>
           <w:tcPr>
-            <w:tcW w:type="dxa" w:w="1881"/>
+            <w:tcW w:type="dxa" w:w="1568"/>
           </w:tcPr>
           <w:p>
             <w:r/>
@@ -800,7 +878,7 @@
         </w:tc>
         <w:tc>
           <w:tcPr>
-            <w:tcW w:type="dxa" w:w="1881"/>
+            <w:tcW w:type="dxa" w:w="1568"/>
           </w:tcPr>
           <w:p>
             <w:r/>
@@ -812,11 +890,25 @@
             </w:r>
           </w:p>
         </w:tc>
+        <w:tc>
+          <w:tcPr>
+            <w:tcW w:type="dxa" w:w="1568"/>
+          </w:tcPr>
+          <w:p>
+            <w:r/>
+            <w:r>
+              <w:rPr>
+                <w:sz w:val="19"/>
+              </w:rPr>
+              <w:t>AART only, by commission</w:t>
+            </w:r>
+          </w:p>
+        </w:tc>
       </w:tr>
       <w:tr>
         <w:tc>
           <w:tcPr>
-            <w:tcW w:type="dxa" w:w="1881"/>
+            <w:tcW w:type="dxa" w:w="1568"/>
           </w:tcPr>
           <w:p>
             <w:r/>
@@ -831,7 +923,7 @@
         </w:tc>
         <w:tc>
           <w:tcPr>
-            <w:tcW w:type="dxa" w:w="1881"/>
+            <w:tcW w:type="dxa" w:w="1568"/>
           </w:tcPr>
           <w:p>
             <w:r/>
@@ -845,7 +937,7 @@
         </w:tc>
         <w:tc>
           <w:tcPr>
-            <w:tcW w:type="dxa" w:w="1881"/>
+            <w:tcW w:type="dxa" w:w="1568"/>
           </w:tcPr>
           <w:p>
             <w:r/>
@@ -859,7 +951,7 @@
         </w:tc>
         <w:tc>
           <w:tcPr>
-            <w:tcW w:type="dxa" w:w="1881"/>
+            <w:tcW w:type="dxa" w:w="1568"/>
           </w:tcPr>
           <w:p>
             <w:r/>
@@ -873,7 +965,21 @@
         </w:tc>
         <w:tc>
           <w:tcPr>
-            <w:tcW w:type="dxa" w:w="1881"/>
+            <w:tcW w:type="dxa" w:w="1568"/>
+          </w:tcPr>
+          <w:p>
+            <w:r/>
+            <w:r>
+              <w:rPr>
+                <w:sz w:val="19"/>
+              </w:rPr>
+              <w:t>No</w:t>
+            </w:r>
+          </w:p>
+        </w:tc>
+        <w:tc>
+          <w:tcPr>
+            <w:tcW w:type="dxa" w:w="1568"/>
           </w:tcPr>
           <w:p>
             <w:r/>
@@ -889,7 +995,7 @@
       <w:tr>
         <w:tc>
           <w:tcPr>
-            <w:tcW w:type="dxa" w:w="1881"/>
+            <w:tcW w:type="dxa" w:w="1568"/>
           </w:tcPr>
           <w:p>
             <w:r/>
@@ -904,7 +1010,7 @@
         </w:tc>
         <w:tc>
           <w:tcPr>
-            <w:tcW w:type="dxa" w:w="1881"/>
+            <w:tcW w:type="dxa" w:w="1568"/>
           </w:tcPr>
           <w:p>
             <w:r/>
@@ -918,7 +1024,7 @@
         </w:tc>
         <w:tc>
           <w:tcPr>
-            <w:tcW w:type="dxa" w:w="1881"/>
+            <w:tcW w:type="dxa" w:w="1568"/>
           </w:tcPr>
           <w:p>
             <w:r/>
@@ -932,7 +1038,7 @@
         </w:tc>
         <w:tc>
           <w:tcPr>
-            <w:tcW w:type="dxa" w:w="1881"/>
+            <w:tcW w:type="dxa" w:w="1568"/>
           </w:tcPr>
           <w:p>
             <w:r/>
@@ -946,7 +1052,7 @@
         </w:tc>
         <w:tc>
           <w:tcPr>
-            <w:tcW w:type="dxa" w:w="1881"/>
+            <w:tcW w:type="dxa" w:w="1568"/>
           </w:tcPr>
           <w:p>
             <w:r/>
@@ -958,12 +1064,39 @@
             </w:r>
           </w:p>
         </w:tc>
+        <w:tc>
+          <w:tcPr>
+            <w:tcW w:type="dxa" w:w="1568"/>
+          </w:tcPr>
+          <w:p>
+            <w:r/>
+            <w:r>
+              <w:rPr>
+                <w:sz w:val="19"/>
+              </w:rPr>
+              <w:t>Commissioned single-source (BSCRA/Genesis)</w:t>
+            </w:r>
+          </w:p>
+        </w:tc>
       </w:tr>
     </w:tbl>
     <w:p>
       <w:pPr>
         <w:spacing w:after="80"/>
       </w:pPr>
+    </w:p>
+    <w:p>
+      <w:pPr>
+        <w:spacing w:after="200"/>
+      </w:pPr>
+      <w:r>
+        <w:rPr>
+          <w:i/>
+          <w:color w:val="59635F"/>
+          <w:sz w:val="19"/>
+        </w:rPr>
+        <w:t>Notably, Remora 1/2 and Trixie 2 come from the same developer (AART) — see §3. The table is best read as a spectrum of models one team is willing to build, not a lineup of competing philosophies.</w:t>
+      </w:r>
     </w:p>
     <w:p>
       <w:pPr>
@@ -1173,7 +1306,7 @@
         <w:rPr>
           <w:i w:val="0"/>
         </w:rPr>
-        <w:t>None of the four models has a business model that is obviously sustainable at hobby-market volumes, and the working group should not pretend otherwise. Fully open (Remora 1) relies on voluntary compliance with a royalty request that has no realistic enforcement mechanism — it sustains itself on goodwill, a pattern that tends to produce burnout rather than a durable supply of product. Open manufacturing + licensed resale (Remora 2) is a more conventional attempt, closer to how an open instruction-set architecture can still support licensed silicon vendors — but it only works if governing bodies give licensed builders some recognition unlicensed clones don't get, itself a policy choice needing consensus. Closed, semi-open engagement (SBM) monetizes through direct sales with the designer's expertise as the moat, and is only as durable as that small business. Fully closed (Latslot) is the most conventional model and, all else equal, the easiest to keep funded — at the cost of the least insight into what racers are actually racing.</w:t>
+        <w:t>None of these models is obviously sustainable at hobby-market volumes, and the working group should not pretend otherwise. Fully open (Remora 1) relies on voluntary compliance with a royalty request that has no realistic enforcement mechanism — it sustains itself on goodwill, a pattern that tends to produce burnout rather than a durable supply of product. Open manufacturing + licensed resale (Remora 2) is a more conventional attempt, closer to how an open instruction-set architecture can still support licensed silicon vendors — but it only works if governing bodies give licensed builders some recognition unlicensed clones don't get, itself a policy choice needing consensus. Closed, semi-open engagement (SBM) monetizes through direct sales with the designer's expertise as the moat, and is only as durable as that small business. Fully closed (Latslot) is the most conventional model and, all else equal, the easiest to keep funded — at the cost of the least insight into what racers are actually racing. Commissioned single-source (Trixie 2) sidesteps the open-market sustainability question entirely by tying the business model to one customer relationship — BSCRA/Genesis — rather than retail sales: arguably the most commercially secure for as long as that relationship holds, and the least resilient if it doesn't, since by design there is no other supplier to fall back on.</w:t>
       </w:r>
     </w:p>
     <w:p>
@@ -1455,7 +1588,7 @@
         <w:rPr>
           <w:i w:val="0"/>
         </w:rPr>
-        <w:t>Several current and prospective boards — the discussion around locking a “Trixie”-class board is a live example — use STMicroelectronics-style microcontrollers, which support hardware Readout Protection (RDP) at the silicon level. Worth explaining plainly, so the working group isn't talking past itself about what “locking the board” actually forecloses:</w:t>
+        <w:t>Several current and prospective boards — the MidAmerica Trixie 2 (§3) is a live, concrete example, shipping today at RDP Level 2 — use STMicroelectronics-style microcontrollers, which support hardware Readout Protection (RDP) at the silicon level. Worth explaining plainly, so the working group isn't talking past itself about what “locking the board” actually forecloses:</w:t>
       </w:r>
     </w:p>
     <w:p>

</xml_diff>

<commit_message>
Add Latslot hardware evolution and reverse-protection comparison
- Latslot processor upgrade and ~19,000Kv/12-mag capability (per
  Ralfs Leitis), plus observed higher minimum-start-voltage and
  low-voltage-shutdown thresholds vs. Remora across 10-25k Kv testing.
- Add minimum-start-voltage/shutdown-threshold and reverse-voltage
  protection as two more design-spec parameters, since neither is
  captured by the Ke/Kv curve alone.
- Add a reverse-voltage protection row to the open/closed comparison
  table (SBM, Remora 1/2, Latslot, Trixie 2), and note its omission on
  Do-Slot and Signature Frankie boards to save space.
- Two new open questions on bounding start/shutdown voltage and
  mandating reverse protection.

Co-Authored-By: Claude Sonnet 5 <noreply@anthropic.com>
</commit_message>
<xml_diff>
--- a/ecom-standardization-charter.docx
+++ b/ecom-standardization-charter.docx
@@ -563,6 +563,36 @@
           <w:i w:val="0"/>
         </w:rPr>
         <w:t>This is worth recording for two reasons. First, it is a second concrete instance — alongside AART's Remora/Trixie 2/Slot.it portfolio — of open and closed participants finding a working arrangement rather than treating the divide as absolute; the working group should not assume open-source licensing and closed-vendor IP are structurally incompatible — here, negotiated, they weren't. Second, it is a direct illustration of why field-configurable timing advance and braking behavior — exactly the parameters at issue in the BSL divergence above — cannot be fully captured by checking what left the factory: if a UART programmer can retune an eCom's advance or braking after homologation, “as shipped” compliance and “as raced” compliance are not the same question, and only a trackside behavioral check (§6–7) catches the difference regardless of which vendor's programmer made the change.</w:t>
+      </w:r>
+    </w:p>
+    <w:p>
+      <w:pPr>
+        <w:pStyle w:val="Heading3"/>
+      </w:pPr>
+      <w:r>
+        <w:t>2026 — Latslot hardware evolution, and two more parameters the spec needs</w:t>
+      </w:r>
+    </w:p>
+    <w:p>
+      <w:pPr>
+        <w:spacing w:after="200"/>
+      </w:pPr>
+      <w:r>
+        <w:rPr>
+          <w:i w:val="0"/>
+        </w:rPr>
+        <w:t>Latslot's hardware has not stood still either. According to Ralfs Leitis, the board has been through revisions that include a faster processor, and current Latslot units are reportedly capable of running motors up to around 19,000Kv on a 12-magnet rotor — a substantially higher spec ceiling than earlier revisions supported. But raw Kv capability isn't the whole behavioral picture: side-by-side testing across a Kv range from 10,000 to 25,000 found that Latslot units need noticeably more trigger — more applied voltage — before the motor starts turning at all, compared to a Remora on the same track and controller. The same testing suggests the low-voltage shutdown threshold is set meaningfully higher on Latslot than on Remora as well. Neither of these is captured by the Ke/Kv curve alone (see the scrutineering proposal below), which describes behavior once the motor is already turning — they're a different pair of parameters: the minimum voltage required to initiate motion, and the voltage at which the eCom cuts out. Both directly affect how a car feels to drive off the line and under braking-to-a-stop, independent of top-end performance, and both belong in the design spec's bound list (§6) alongside the parameters already listed there.</w:t>
+      </w:r>
+    </w:p>
+    <w:p>
+      <w:pPr>
+        <w:spacing w:after="200"/>
+      </w:pPr>
+      <w:r>
+        <w:rPr>
+          <w:i w:val="0"/>
+        </w:rPr>
+        <w:t>A second, purely hardware difference worth recording is reverse-voltage protection — whether a board protects itself (and the motor) against a reversed power connection, and how robust that protection actually is. This has varied across almost every design discussed in this paper: the original double-sided SBM board had reverse protection of a sort, but the N-channel MOSFET used for it was undersized and slow. Every Remora — including the space-constrained single-sided Remora 2 — has included reverse protection, and later Remora revisions use a more sophisticated circuit than Remora 1's original (already adequate) implementation. Trixie 2 also includes reverse protection, using a different circuit from Remora 2's. But protection circuitry costs board area, and it's exactly the kind of feature that gets cut under space pressure: the newer single-sided Do-Slot boards, and the Signature Frankie boards, omit it entirely. Whether reverse protection should be mandatory, optional-but-disclosed, or left entirely to individual manufacturers is a real design-spec decision (§6) — it's a safety and reliability question, not just a business one, and it's currently being decided implicitly, board by board, rather than by any shared standard.</w:t>
       </w:r>
     </w:p>
     <w:p>
@@ -1180,6 +1210,93 @@
           </w:p>
         </w:tc>
       </w:tr>
+      <w:tr>
+        <w:tc>
+          <w:tcPr>
+            <w:tcW w:type="dxa" w:w="1568"/>
+          </w:tcPr>
+          <w:p>
+            <w:r/>
+            <w:r>
+              <w:rPr>
+                <w:b/>
+                <w:sz w:val="19"/>
+              </w:rPr>
+              <w:t>Reverse-voltage protection</w:t>
+            </w:r>
+          </w:p>
+        </w:tc>
+        <w:tc>
+          <w:tcPr>
+            <w:tcW w:type="dxa" w:w="1568"/>
+          </w:tcPr>
+          <w:p>
+            <w:r/>
+            <w:r>
+              <w:rPr>
+                <w:sz w:val="19"/>
+              </w:rPr>
+              <w:t>Yes — original circuit</w:t>
+            </w:r>
+          </w:p>
+        </w:tc>
+        <w:tc>
+          <w:tcPr>
+            <w:tcW w:type="dxa" w:w="1568"/>
+          </w:tcPr>
+          <w:p>
+            <w:r/>
+            <w:r>
+              <w:rPr>
+                <w:sz w:val="19"/>
+              </w:rPr>
+              <w:t>Yes — more sophisticated circuit, single-sided</w:t>
+            </w:r>
+          </w:p>
+        </w:tc>
+        <w:tc>
+          <w:tcPr>
+            <w:tcW w:type="dxa" w:w="1568"/>
+          </w:tcPr>
+          <w:p>
+            <w:r/>
+            <w:r>
+              <w:rPr>
+                <w:sz w:val="19"/>
+              </w:rPr>
+              <w:t>Partial — undersized, slow N-channel MOSFET</w:t>
+            </w:r>
+          </w:p>
+        </w:tc>
+        <w:tc>
+          <w:tcPr>
+            <w:tcW w:type="dxa" w:w="1568"/>
+          </w:tcPr>
+          <w:p>
+            <w:r/>
+            <w:r>
+              <w:rPr>
+                <w:sz w:val="19"/>
+              </w:rPr>
+              <w:t>Not publicly documented</w:t>
+            </w:r>
+          </w:p>
+        </w:tc>
+        <w:tc>
+          <w:tcPr>
+            <w:tcW w:type="dxa" w:w="1568"/>
+          </w:tcPr>
+          <w:p>
+            <w:r/>
+            <w:r>
+              <w:rPr>
+                <w:sz w:val="19"/>
+              </w:rPr>
+              <w:t>Yes — different circuit from Remora 2</w:t>
+            </w:r>
+          </w:p>
+        </w:tc>
+      </w:tr>
     </w:tbl>
     <w:p>
       <w:pPr>
@@ -1662,7 +1779,7 @@
           <w:b w:val="0"/>
           <w:i w:val="0"/>
         </w:rPr>
-        <w:t>This should define the performance envelope, not the implementation. At minimum, it should bound: permissible Ke/Kv range for a given class; timing-advance limits (see the BSL Do-Slot/Trixie 2 divergence in §3 for exactly why this needs a bound, not just a brand list); startup/synchronization PWM frequency, and the rate at which duty cycle is permitted to ramp up during that sync phase — both shape how a car launches off the line, and both are exactly the kind of parameter a UART programmer (§3, AART/Latslot) can retune after homologation; maximum permitted duty cycle, which caps delivered power independently of the current/thermal limits below; PWM switching frequency, low and high, which affects motor heating, efficiency, and driver-perceptible behavior; permitted duty-cycle range during drag braking, since brake strength is as much a competitive parameter as top speed, and just as easy to tune outside a “fair” envelope; current/thermal limits; mechanical footprint and connector standard; permitted feature set (explicitly prohibiting traction control, launch control, or competitor-aware behavior); and required safety behavior (brownout/low-voltage cutoff, fail-safe on signal loss).</w:t>
+        <w:t>This should define the performance envelope, not the implementation. At minimum, it should bound: permissible Ke/Kv range for a given class; timing-advance limits (see the BSL Do-Slot/Trixie 2 divergence in §3 for exactly why this needs a bound, not just a brand list); startup/synchronization PWM frequency, and the rate at which duty cycle is permitted to ramp up during that sync phase — both shape how a car launches off the line, and both are exactly the kind of parameter a UART programmer (§3, AART/Latslot) can retune after homologation; maximum permitted duty cycle, which caps delivered power independently of the current/thermal limits below; PWM switching frequency, low and high, which affects motor heating, efficiency, and driver-perceptible behavior; permitted duty-cycle range during drag braking, since brake strength is as much a competitive parameter as top speed, and just as easy to tune outside a “fair” envelope; current/thermal limits; mechanical footprint and connector standard; permitted feature set (explicitly prohibiting traction control, launch control, or competitor-aware behavior); required safety behavior (brownout/low-voltage cutoff, fail-safe on signal loss); minimum voltage required to initiate motion and the low-voltage shutdown threshold — both separate from the Ke/Kv curve above, both directly felt by the driver as trigger response, and both observed to differ meaningfully between current products (see the Latslot/Remora comparison in §3); and whether reverse-voltage/polarity protection is required, and to what standard — a real safety/reliability feature that costs board area and is already omitted on some current single-sided designs to save space (§3).</w:t>
       </w:r>
     </w:p>
     <w:p>
@@ -2281,6 +2398,24 @@
       </w:pPr>
       <w:r>
         <w:t>Is a negotiated, partial-disclosure compromise like AART and Latslot's (open-source the patch, withhold the underlying protocol spec) a model the working group should formalize — e.g. a standing NDA-plus-open-release template — for future cross-vendor interoperability work, or a one-off that shouldn't be relied on?</w:t>
+      </w:r>
+    </w:p>
+    <w:p>
+      <w:pPr>
+        <w:pStyle w:val="ListBullet"/>
+        <w:spacing w:after="120"/>
+      </w:pPr>
+      <w:r>
+        <w:t>Given the observed gap between Latslot's and Remora's minimum start voltage and low-voltage shutdown threshold, how tight should the spec's bound on these be — and should it be expressed as an absolute voltage, or relative to a given Kv/class, given both affect trigger feel directly?</w:t>
+      </w:r>
+    </w:p>
+    <w:p>
+      <w:pPr>
+        <w:pStyle w:val="ListBullet"/>
+        <w:spacing w:after="120"/>
+      </w:pPr>
+      <w:r>
+        <w:t>Should reverse-voltage protection be mandatory in the design spec, and to what standard — given it is already omitted on at least two current single-sided products (Do-Slot, Signature Frankie) specifically to save board space?</w:t>
       </w:r>
     </w:p>
     <w:p>

</xml_diff>